<commit_message>
Update PLaND title and author names
</commit_message>
<xml_diff>
--- a/output/docx/PLAND_SAS_SUBMISSION.docx
+++ b/output/docx/PLAND_SAS_SUBMISSION.docx
@@ -14,7 +14,7 @@
           <w:b/>
           <w:sz w:val="28"/>
         </w:rPr>
-        <w:t>Path to Least Non-Determinism: A Controlled Method for Turning Agent Skills into Hybrid Workflows</w:t>
+        <w:t>PLaND - Path to Least Non Determinism</w:t>
       </w:r>
     </w:p>
     <w:p>
@@ -29,7 +29,7 @@
           <w:b/>
           <w:sz w:val="20"/>
         </w:rPr>
-        <w:t>Sai Krishna</w:t>
+        <w:t>Maddipatla Naga Venkata Sai Krishna</w:t>
       </w:r>
       <w:r>
         <w:rPr>
@@ -44,22 +44,7 @@
           <w:b/>
           <w:sz w:val="20"/>
         </w:rPr>
-        <w:t>Asit Sahoo</w:t>
-      </w:r>
-    </w:p>
-    <w:p>
-      <w:pPr>
-        <w:keepNext/>
-        <w:spacing w:before="0" w:after="160" w:line="240" w:lineRule="auto"/>
-        <w:jc w:val="center"/>
-      </w:pPr>
-      <w:r>
-        <w:rPr>
-          <w:rFonts w:ascii="Times New Roman" w:hAnsi="Times New Roman" w:eastAsia="Times New Roman"/>
-          <w:i/>
-          <w:sz w:val="20"/>
-        </w:rPr>
-        <w:t>Author affiliations, addresses, and corresponding-author details will be added before submission.</w:t>
+        <w:t>Asit Kumar Sahoo</w:t>
       </w:r>
     </w:p>
     <w:p>
@@ -87,7 +72,7 @@
           <w:rFonts w:ascii="Times New Roman" w:hAnsi="Times New Roman" w:eastAsia="Times New Roman"/>
           <w:sz w:val="20"/>
         </w:rPr>
-        <w:t>Language-model agents often repeat simple work because every step of a standard operating procedure is written in natural language. We present Path to Least Non-Determinism (PLaND), an evaluation-driven methodology that keeps judgment in natural language but moves stable work into references, Python, or Bash. The initial system prompt is generated once and frozen after baseline measurement. The model, prompt, harness, data, answers, scorer, seed, and permissions then remain unchanged; only the workflow skill package may evolve. We prepared development, validation, and untouched test partitions and used a prespecified local release gate before opening each test set. On a balanced top-10 single-label LEDGAR subset, the hybrid passed validation and was evaluated once on 1,000 untouched cases. Accuracy changed from 93.5% to 92.7%, a paired difference of -0.8 percentage points with a bootstrap 95% confidence interval from -1.6 to 0.0 points. Tokens fell from 376,088 to 225,573, a 40.0% reduction, and sequential per-case harness latency fell from 0.764 to 0.455 seconds. The hybrid bypassed 411 of 1,000 model calls. On CFPB complaint routing, tokens fell by 41.8%, but accuracy fell from 79% to 72%; the candidate failed both the quality and viability gates. SpamAssassin failed the relative gates, while QS-OCR, SROIE, and an RVL-CDIP mirror failed baseline viability. Their tests remained untouched. These results show the intended behavior of the method: accept measurable savings only when a frozen quality contract is met, and preserve failures as evidence. The current study measures model-mediated work, not run-to-run stochastic variance.</w:t>
+        <w:t>Language-model agents often repeat simple work because every step of a standard operating procedure is written in natural language. We present Path to Least Non Determinism (PLaND), an evaluation-driven methodology that keeps judgment in natural language but moves stable work into references, Python, or Bash. The initial system prompt is generated once and frozen after baseline measurement. The model, prompt, harness, data, answers, scorer, seed, and permissions then remain unchanged; only the workflow skill package may evolve. We prepared development, validation, and untouched test partitions and used a prespecified local release gate before opening each test set. On a balanced top-10 single-label LEDGAR subset, the hybrid passed validation and was evaluated once on 1,000 untouched cases. Accuracy changed from 93.5% to 92.7%, a paired difference of -0.8 percentage points with a bootstrap 95% confidence interval from -1.6 to 0.0 points. Tokens fell from 376,088 to 225,573, a 40.0% reduction, and sequential per-case harness latency fell from 0.764 to 0.455 seconds. The hybrid bypassed 411 of 1,000 model calls. On CFPB complaint routing, tokens fell by 41.8%, but accuracy fell from 79% to 72%; the candidate failed both the quality and viability gates. SpamAssassin failed the relative gates, while QS-OCR, SROIE, and an RVL-CDIP mirror failed baseline viability. Their tests remained untouched. These results show the intended behavior of the method: accept measurable savings only when a frozen quality contract is met, and preserve failures as evidence. The current study measures model-mediated work, not run-to-run stochastic variance.</w:t>
       </w:r>
     </w:p>
     <w:p>

</xml_diff>